<commit_message>
docs(governanca): restaura rastreabilidade dos revisores
</commit_message>
<xml_diff>
--- a/docs/governanca-ia/registros/15_Correcoes_Finais_da_Revisao_da_Spec_001.docx
+++ b/docs/governanca-ia/registros/15_Correcoes_Finais_da_Revisao_da_Spec_001.docx
@@ -841,7 +841,7 @@
                 <w:color w:val="000000"/>
                 <w:sz w:val="19"/>
               </w:rPr>
-              <w:t>Alterações aprovadas pela equipe em 28/09/2026.</w:t>
+              <w:t>Alterações validadas pelo solicitante nesta conversa em 28/09/2026.</w:t>
             </w:r>
           </w:p>
         </w:tc>
@@ -1295,7 +1295,7 @@
                 <w:color w:val="000000"/>
                 <w:sz w:val="19"/>
               </w:rPr>
-              <w:t>Equipe.</w:t>
+              <w:t>Solicitante da alteração (identidade não registrada no RIA).</w:t>
             </w:r>
           </w:p>
         </w:tc>

</xml_diff>